<commit_message>
Adiciona produtos em produção e showcase Laravel Inertia
Destaca Officina Pro, Salão Elite e Iguatemi Notícias no perfil,
LinkedIn e currículo. Inclui gestao-pedidos-laravel com filas Redis,
Pest, Docker e CI como evidência de código auditável.
</commit_message>
<xml_diff>
--- a/perfil/Curriculo_Wagner_Lima_Chimenez.docx
+++ b/perfil/Curriculo_Wagner_Lima_Chimenez.docx
@@ -4,7 +4,6 @@
   <w:body>
     <w:p>
       <w:pPr>
-        <w:spacing w:after="40"/>
         <w:jc w:val="center"/>
       </w:pPr>
       <w:r>
@@ -19,7 +18,6 @@
     </w:p>
     <w:p>
       <w:pPr>
-        <w:spacing w:after="40"/>
         <w:jc w:val="center"/>
       </w:pPr>
       <w:r>
@@ -28,12 +26,11 @@
           <w:b/>
           <w:sz w:val="22"/>
         </w:rPr>
-        <w:t>Desenvolvedor Full Stack Sênior  ·  PHP · Laravel · Vue.js</w:t>
+        <w:t>Desenvolvedor Full Stack Sênior  ·  PHP · Laravel · Vue.js / Inertia</w:t>
       </w:r>
     </w:p>
     <w:p>
       <w:pPr>
-        <w:spacing w:after="120"/>
         <w:jc w:val="center"/>
       </w:pPr>
       <w:r>
@@ -67,7 +64,7 @@
     </w:p>
     <w:p>
       <w:pPr>
-        <w:spacing w:after="120" w:before="0"/>
+        <w:spacing w:after="80"/>
       </w:pPr>
       <w:r>
         <w:rPr>
@@ -75,7 +72,63 @@
           <w:b w:val="0"/>
           <w:sz w:val="20"/>
         </w:rPr>
-        <w:t>Desenvolvedor Full Stack Sênior com foco em PHP, Laravel e Vue.js, atuando em aplicações web de médio e grande porte (e-commerce, SaaS, RH, EAD e portais corporativos). Experiência com APIs REST, filas (RabbitMQ), Redis, Docker, TDD e monitoramento (New Relic/Graylog). Busco oportunidades remotas em Full Stack ou Backend PHP/Laravel + Vue.js, com entregas alinhadas a performance, segurança e manutenibilidade.</w:t>
+        <w:t>Desenvolvedor Full Stack Sênior com foco em PHP, Laravel e Vue.js (Inertia). Experiência em e-commerce, SaaS em produção, APIs REST, filas, Docker e TDD. Busco oportunidades remotas em Full Stack / Backend PHP/Laravel + Vue/Inertia.</w:t>
+      </w:r>
+    </w:p>
+    <w:p>
+      <w:pPr>
+        <w:spacing w:before="200" w:after="80"/>
+        <w:pBdr>
+          <w:bottom w:val="single" w:sz="12" w:space="4" w:color="1A365D"/>
+        </w:pBdr>
+      </w:pPr>
+      <w:r>
+        <w:rPr>
+          <w:rFonts w:ascii="Calibri" w:hAnsi="Calibri" w:eastAsia="Calibri"/>
+          <w:b/>
+          <w:color w:val="1A365D"/>
+          <w:sz w:val="28"/>
+        </w:rPr>
+        <w:t>PRODUTOS E PROJETOS EM PRODUÇÃO</w:t>
+      </w:r>
+    </w:p>
+    <w:p>
+      <w:pPr>
+        <w:spacing w:after="80"/>
+      </w:pPr>
+      <w:r>
+        <w:rPr>
+          <w:rFonts w:ascii="Calibri" w:hAnsi="Calibri" w:eastAsia="Calibri"/>
+          <w:b w:val="0"/>
+          <w:sz w:val="20"/>
+        </w:rPr>
+        <w:t>Officina Pro (SaaS próprio) — https://officinapro.com.br — gestão para oficinas · Laravel + Inertia/Vue</w:t>
+      </w:r>
+    </w:p>
+    <w:p>
+      <w:pPr>
+        <w:spacing w:after="80"/>
+      </w:pPr>
+      <w:r>
+        <w:rPr>
+          <w:rFonts w:ascii="Calibri" w:hAnsi="Calibri" w:eastAsia="Calibri"/>
+          <w:b w:val="0"/>
+          <w:sz w:val="20"/>
+        </w:rPr>
+        <w:t>Salão Elite (SaaS próprio) — https://salaoelite.com.br — gestão para salões · Laravel + Inertia/Vue</w:t>
+      </w:r>
+    </w:p>
+    <w:p>
+      <w:pPr>
+        <w:spacing w:after="80"/>
+      </w:pPr>
+      <w:r>
+        <w:rPr>
+          <w:rFonts w:ascii="Calibri" w:hAnsi="Calibri" w:eastAsia="Calibri"/>
+          <w:b w:val="0"/>
+          <w:sz w:val="20"/>
+        </w:rPr>
+        <w:t>Iguatemi Notícias (cliente) — https://iguateminoticias.com.br — portal de notícias · Laravel</w:t>
       </w:r>
     </w:p>
     <w:p>
@@ -97,7 +150,7 @@
     </w:p>
     <w:p>
       <w:pPr>
-        <w:spacing w:after="40" w:before="0"/>
+        <w:spacing w:after="80"/>
       </w:pPr>
       <w:r>
         <w:rPr>
@@ -105,12 +158,12 @@
           <w:b w:val="0"/>
           <w:sz w:val="20"/>
         </w:rPr>
-        <w:t>Backend: PHP 8, Laravel, Symfony, APIs REST, NestJS (complementar)</w:t>
+        <w:t>Backend: PHP 8, Laravel, Symfony, Inertia.js, APIs REST</w:t>
       </w:r>
     </w:p>
     <w:p>
       <w:pPr>
-        <w:spacing w:after="40" w:before="0"/>
+        <w:spacing w:after="80"/>
       </w:pPr>
       <w:r>
         <w:rPr>
@@ -118,12 +171,12 @@
           <w:b w:val="0"/>
           <w:sz w:val="20"/>
         </w:rPr>
-        <w:t>Frontend: Vue.js, JavaScript, TypeScript, React (quando o projeto exige)</w:t>
+        <w:t>Frontend: Vue.js, JavaScript, TypeScript, React (quando necessário)</w:t>
       </w:r>
     </w:p>
     <w:p>
       <w:pPr>
-        <w:spacing w:after="40" w:before="0"/>
+        <w:spacing w:after="80"/>
       </w:pPr>
       <w:r>
         <w:rPr>
@@ -131,12 +184,12 @@
           <w:b w:val="0"/>
           <w:sz w:val="20"/>
         </w:rPr>
-        <w:t>Dados / async: MySQL, PostgreSQL, Redis, RabbitMQ</w:t>
+        <w:t>Dados/async: MySQL, PostgreSQL, Redis, RabbitMQ</w:t>
       </w:r>
     </w:p>
     <w:p>
       <w:pPr>
-        <w:spacing w:after="40" w:before="0"/>
+        <w:spacing w:after="80"/>
       </w:pPr>
       <w:r>
         <w:rPr>
@@ -144,20 +197,7 @@
           <w:b w:val="0"/>
           <w:sz w:val="20"/>
         </w:rPr>
-        <w:t>Qualidade / ops: PHPUnit, TDD, Docker, New Relic, Graylog, Git, Scrum, Kanban</w:t>
-      </w:r>
-    </w:p>
-    <w:p>
-      <w:pPr>
-        <w:spacing w:after="120" w:before="0"/>
-      </w:pPr>
-      <w:r>
-        <w:rPr>
-          <w:rFonts w:ascii="Calibri" w:hAnsi="Calibri" w:eastAsia="Calibri"/>
-          <w:b w:val="0"/>
-          <w:sz w:val="20"/>
-        </w:rPr>
-        <w:t>Complementar: Flutter, React Native (projetos de chat e apps)</w:t>
+        <w:t>Qualidade/ops: PHPUnit, Pest, TDD, Docker, New Relic, Graylog, Git, Scrum/Kanban</w:t>
       </w:r>
     </w:p>
     <w:p>
@@ -200,7 +240,7 @@
     </w:p>
     <w:p>
       <w:pPr>
-        <w:spacing w:after="40" w:before="0"/>
+        <w:spacing w:after="40"/>
       </w:pPr>
       <w:r>
         <w:rPr>
@@ -215,7 +255,7 @@
     <w:p>
       <w:pPr>
         <w:pStyle w:val="ListBullet"/>
-        <w:spacing w:after="20" w:before="0"/>
+        <w:spacing w:after="20"/>
       </w:pPr>
       <w:r>
         <w:rPr>
@@ -223,35 +263,7 @@
           <w:b w:val="0"/>
           <w:sz w:val="20"/>
         </w:rPr>
-        <w:t>Desenvolvimento e manutenção de sistema web com Laravel (backend) e Vue.js/PrimeVue; módulos em React com TypeScript.</w:t>
-      </w:r>
-    </w:p>
-    <w:p>
-      <w:pPr>
-        <w:pStyle w:val="ListBullet"/>
-        <w:spacing w:after="20" w:before="0"/>
-      </w:pPr>
-      <w:r>
-        <w:rPr>
-          <w:rFonts w:ascii="Calibri" w:hAnsi="Calibri" w:eastAsia="Calibri"/>
-          <w:b w:val="0"/>
-          <w:sz w:val="20"/>
-        </w:rPr>
-        <w:t>APIs REST e integração com meios de pagamento; MySQL com foco em estabilidade e manutenibilidade.</w:t>
-      </w:r>
-    </w:p>
-    <w:p>
-      <w:pPr>
-        <w:pStyle w:val="ListBullet"/>
-        <w:spacing w:after="20" w:before="0"/>
-      </w:pPr>
-      <w:r>
-        <w:rPr>
-          <w:rFonts w:ascii="Calibri" w:hAnsi="Calibri" w:eastAsia="Calibri"/>
-          <w:b w:val="0"/>
-          <w:sz w:val="20"/>
-        </w:rPr>
-        <w:t>Trabalho remoto com entregas contínuas de funcionalidades e correções.</w:t>
+        <w:t>Laravel + Vue/PrimeVue e React/TypeScript; APIs REST e meios de pagamento; MySQL.</w:t>
       </w:r>
     </w:p>
     <w:p>
@@ -277,7 +289,7 @@
     </w:p>
     <w:p>
       <w:pPr>
-        <w:spacing w:after="40" w:before="0"/>
+        <w:spacing w:after="40"/>
       </w:pPr>
       <w:r>
         <w:rPr>
@@ -292,7 +304,7 @@
     <w:p>
       <w:pPr>
         <w:pStyle w:val="ListBullet"/>
-        <w:spacing w:after="20" w:before="0"/>
+        <w:spacing w:after="20"/>
       </w:pPr>
       <w:r>
         <w:rPr>
@@ -300,21 +312,7 @@
           <w:b w:val="0"/>
           <w:sz w:val="20"/>
         </w:rPr>
-        <w:t>Chat interno para suporte: backend NestJS + PostgreSQL; integração Flutter → NestJS via API REST.</w:t>
-      </w:r>
-    </w:p>
-    <w:p>
-      <w:pPr>
-        <w:pStyle w:val="ListBullet"/>
-        <w:spacing w:after="20" w:before="0"/>
-      </w:pPr>
-      <w:r>
-        <w:rPr>
-          <w:rFonts w:ascii="Calibri" w:hAnsi="Calibri" w:eastAsia="Calibri"/>
-          <w:b w:val="0"/>
-          <w:sz w:val="20"/>
-        </w:rPr>
-        <w:t>Comunicação HTTP e WebSocket; frontend complementar em React.</w:t>
+        <w:t>Chat interno NestJS + PostgreSQL; Flutter/React; REST e WebSocket.</w:t>
       </w:r>
     </w:p>
     <w:p>
@@ -340,7 +338,7 @@
     </w:p>
     <w:p>
       <w:pPr>
-        <w:spacing w:after="40" w:before="0"/>
+        <w:spacing w:after="40"/>
       </w:pPr>
       <w:r>
         <w:rPr>
@@ -349,13 +347,13 @@
           <w:color w:val="4A5568"/>
           <w:sz w:val="20"/>
         </w:rPr>
-        <w:t>mar/2022 – jan/2025  ·  ~2 anos 11 meses</w:t>
+        <w:t>mar/2022 – jan/2025</w:t>
       </w:r>
     </w:p>
     <w:p>
       <w:pPr>
         <w:pStyle w:val="ListBullet"/>
-        <w:spacing w:after="20" w:before="0"/>
+        <w:spacing w:after="20"/>
       </w:pPr>
       <w:r>
         <w:rPr>
@@ -363,35 +361,7 @@
           <w:b w:val="0"/>
           <w:sz w:val="20"/>
         </w:rPr>
-        <w:t>Funcionalidades na plataforma de e-commerce com PHP, Laravel e Vue.js.</w:t>
-      </w:r>
-    </w:p>
-    <w:p>
-      <w:pPr>
-        <w:pStyle w:val="ListBullet"/>
-        <w:spacing w:after="20" w:before="0"/>
-      </w:pPr>
-      <w:r>
-        <w:rPr>
-          <w:rFonts w:ascii="Calibri" w:hAnsi="Calibri" w:eastAsia="Calibri"/>
-          <w:b w:val="0"/>
-          <w:sz w:val="20"/>
-        </w:rPr>
-        <w:t>APIs REST para sistemas internos e parceiros; TDD com PHPUnit.</w:t>
-      </w:r>
-    </w:p>
-    <w:p>
-      <w:pPr>
-        <w:pStyle w:val="ListBullet"/>
-        <w:spacing w:after="20" w:before="0"/>
-      </w:pPr>
-      <w:r>
-        <w:rPr>
-          <w:rFonts w:ascii="Calibri" w:hAnsi="Calibri" w:eastAsia="Calibri"/>
-          <w:b w:val="0"/>
-          <w:sz w:val="20"/>
-        </w:rPr>
-        <w:t>Monitoramento com New Relic e Graylog; filas RabbitMQ; Docker no ambiente de desenvolvimento.</w:t>
+        <w:t>E-commerce PHP/Laravel/Vue; APIs REST; TDD; New Relic/Graylog; RabbitMQ; Docker.</w:t>
       </w:r>
     </w:p>
     <w:p>
@@ -417,7 +387,7 @@
     </w:p>
     <w:p>
       <w:pPr>
-        <w:spacing w:after="40" w:before="0"/>
+        <w:spacing w:after="40"/>
       </w:pPr>
       <w:r>
         <w:rPr>
@@ -432,7 +402,7 @@
     <w:p>
       <w:pPr>
         <w:pStyle w:val="ListBullet"/>
-        <w:spacing w:after="20" w:before="0"/>
+        <w:spacing w:after="20"/>
       </w:pPr>
       <w:r>
         <w:rPr>
@@ -440,21 +410,7 @@
           <w:b w:val="0"/>
           <w:sz w:val="20"/>
         </w:rPr>
-        <w:t>Sistema de gestão condominial com PHP, Symfony e Zend Framework.</w:t>
-      </w:r>
-    </w:p>
-    <w:p>
-      <w:pPr>
-        <w:pStyle w:val="ListBullet"/>
-        <w:spacing w:after="20" w:before="0"/>
-      </w:pPr>
-      <w:r>
-        <w:rPr>
-          <w:rFonts w:ascii="Calibri" w:hAnsi="Calibri" w:eastAsia="Calibri"/>
-          <w:b w:val="0"/>
-          <w:sz w:val="20"/>
-        </w:rPr>
-        <w:t>APIs REST (notas tomadas); testes com PHPUnit e Behat; New Relic; RabbitMQ; Docker.</w:t>
+        <w:t>Gestão condominial Symfony/Zend; APIs; PHPUnit/Behat; New Relic; RabbitMQ; Docker.</w:t>
       </w:r>
     </w:p>
     <w:p>
@@ -480,7 +436,7 @@
     </w:p>
     <w:p>
       <w:pPr>
-        <w:spacing w:after="40" w:before="0"/>
+        <w:spacing w:after="40"/>
       </w:pPr>
       <w:r>
         <w:rPr>
@@ -495,7 +451,7 @@
     <w:p>
       <w:pPr>
         <w:pStyle w:val="ListBullet"/>
-        <w:spacing w:after="20" w:before="0"/>
+        <w:spacing w:after="20"/>
       </w:pPr>
       <w:r>
         <w:rPr>
@@ -503,21 +459,7 @@
           <w:b w:val="0"/>
           <w:sz w:val="20"/>
         </w:rPr>
-        <w:t>Gestão de telefonia móvel e vendas: PHP (Laravel/Symfony), Vue.js, TypeScript, MySQL, APIs REST.</w:t>
-      </w:r>
-    </w:p>
-    <w:p>
-      <w:pPr>
-        <w:pStyle w:val="ListBullet"/>
-        <w:spacing w:after="20" w:before="0"/>
-      </w:pPr>
-      <w:r>
-        <w:rPr>
-          <w:rFonts w:ascii="Calibri" w:hAnsi="Calibri" w:eastAsia="Calibri"/>
-          <w:b w:val="0"/>
-          <w:sz w:val="20"/>
-        </w:rPr>
-        <w:t>PHPUnit, New Relic/Graylog, RabbitMQ e Docker.</w:t>
+        <w:t>Telefonia móvel: Laravel/Symfony, Vue, TypeScript, MySQL, filas e Docker.</w:t>
       </w:r>
     </w:p>
     <w:p>
@@ -543,7 +485,7 @@
     </w:p>
     <w:p>
       <w:pPr>
-        <w:spacing w:after="40" w:before="0"/>
+        <w:spacing w:after="40"/>
       </w:pPr>
       <w:r>
         <w:rPr>
@@ -558,7 +500,7 @@
     <w:p>
       <w:pPr>
         <w:pStyle w:val="ListBullet"/>
-        <w:spacing w:after="20" w:before="0"/>
+        <w:spacing w:after="20"/>
       </w:pPr>
       <w:r>
         <w:rPr>
@@ -566,21 +508,7 @@
           <w:b w:val="0"/>
           <w:sz w:val="20"/>
         </w:rPr>
-        <w:t>Sistema de RH com PHP, Laravel/Symfony, Vue.js, JavaScript/TypeScript e MySQL.</w:t>
-      </w:r>
-    </w:p>
-    <w:p>
-      <w:pPr>
-        <w:pStyle w:val="ListBullet"/>
-        <w:spacing w:after="20" w:before="0"/>
-      </w:pPr>
-      <w:r>
-        <w:rPr>
-          <w:rFonts w:ascii="Calibri" w:hAnsi="Calibri" w:eastAsia="Calibri"/>
-          <w:b w:val="0"/>
-          <w:sz w:val="20"/>
-        </w:rPr>
-        <w:t>Funcionalidades web, APIs REST e evolução do produto em ambiente ágil.</w:t>
+        <w:t>Sistema de RH: PHP, Laravel/Symfony, Vue.js, MySQL, APIs REST.</w:t>
       </w:r>
     </w:p>
     <w:p>
@@ -606,7 +534,7 @@
     </w:p>
     <w:p>
       <w:pPr>
-        <w:spacing w:after="40" w:before="0"/>
+        <w:spacing w:after="40"/>
       </w:pPr>
       <w:r>
         <w:rPr>
@@ -621,7 +549,7 @@
     <w:p>
       <w:pPr>
         <w:pStyle w:val="ListBullet"/>
-        <w:spacing w:after="20" w:before="0"/>
+        <w:spacing w:after="20"/>
       </w:pPr>
       <w:r>
         <w:rPr>
@@ -629,7 +557,7 @@
           <w:b w:val="0"/>
           <w:sz w:val="20"/>
         </w:rPr>
-        <w:t>Plataforma educacional (EAD): PHP, Laravel, Vue.js, JavaScript, MySQL e APIs REST.</w:t>
+        <w:t>Plataforma EAD: PHP, Laravel, Vue.js, MySQL.</w:t>
       </w:r>
     </w:p>
     <w:p>
@@ -650,12 +578,12 @@
           <w:b w:val="0"/>
           <w:sz w:val="22"/>
         </w:rPr>
-        <w:t xml:space="preserve">  |  Palancio Soluções em Informática</w:t>
+        <w:t xml:space="preserve">  |  Palancio</w:t>
       </w:r>
     </w:p>
     <w:p>
       <w:pPr>
-        <w:spacing w:after="40" w:before="0"/>
+        <w:spacing w:after="40"/>
       </w:pPr>
       <w:r>
         <w:rPr>
@@ -670,7 +598,7 @@
     <w:p>
       <w:pPr>
         <w:pStyle w:val="ListBullet"/>
-        <w:spacing w:after="20" w:before="0"/>
+        <w:spacing w:after="20"/>
       </w:pPr>
       <w:r>
         <w:rPr>
@@ -678,7 +606,7 @@
           <w:b w:val="0"/>
           <w:sz w:val="20"/>
         </w:rPr>
-        <w:t>Sistema PDV (frente de caixa): PHP/Laravel, JavaScript, MySQL; também módulos desktop (WINDEV/GVINCE).</w:t>
+        <w:t>PDV frente de caixa: PHP/Laravel, JavaScript, MySQL.</w:t>
       </w:r>
     </w:p>
     <w:p>
@@ -699,12 +627,12 @@
           <w:b w:val="0"/>
           <w:sz w:val="22"/>
         </w:rPr>
-        <w:t xml:space="preserve">  |  UNIGRAN – Centro Universitário da Grande Dourados</w:t>
+        <w:t xml:space="preserve">  |  UNIGRAN</w:t>
       </w:r>
     </w:p>
     <w:p>
       <w:pPr>
-        <w:spacing w:after="40" w:before="0"/>
+        <w:spacing w:after="40"/>
       </w:pPr>
       <w:r>
         <w:rPr>
@@ -719,7 +647,7 @@
     <w:p>
       <w:pPr>
         <w:pStyle w:val="ListBullet"/>
-        <w:spacing w:after="20" w:before="0"/>
+        <w:spacing w:after="20"/>
       </w:pPr>
       <w:r>
         <w:rPr>
@@ -727,7 +655,7 @@
           <w:b w:val="0"/>
           <w:sz w:val="20"/>
         </w:rPr>
-        <w:t>Sites institucionais e plataforma EAD: PHP, HTML, CSS, JavaScript, jQuery e MySQL.</w:t>
+        <w:t>Sites e EAD: PHP, HTML, CSS, JavaScript, MySQL.</w:t>
       </w:r>
     </w:p>
     <w:p>
@@ -749,7 +677,7 @@
     </w:p>
     <w:p>
       <w:pPr>
-        <w:spacing w:after="40" w:before="0"/>
+        <w:spacing w:after="80"/>
       </w:pPr>
       <w:r>
         <w:rPr>
@@ -757,12 +685,12 @@
           <w:b w:val="0"/>
           <w:sz w:val="20"/>
         </w:rPr>
-        <w:t>Pós-graduação em Gestão de TI — Anhanguera Educacional (Campo Grande, MS) · 2013–2014</w:t>
+        <w:t>Pós-graduação em Gestão de TI — Anhanguera · 2013–2014</w:t>
       </w:r>
     </w:p>
     <w:p>
       <w:pPr>
-        <w:spacing w:after="120" w:before="0"/>
+        <w:spacing w:after="80"/>
       </w:pPr>
       <w:r>
         <w:rPr>
@@ -770,7 +698,7 @@
           <w:b w:val="0"/>
           <w:sz w:val="20"/>
         </w:rPr>
-        <w:t>Bacharelado em Ciência da Computação — Centro Universitário da Grande Dourados · 2005–2010</w:t>
+        <w:t>Bacharelado em Ciência da Computação — UNIGRAN · 2005–2010</w:t>
       </w:r>
     </w:p>
     <w:p>
@@ -787,13 +715,12 @@
           <w:color w:val="1A365D"/>
           <w:sz w:val="28"/>
         </w:rPr>
-        <w:t>CERTIFICAÇÕES E CURSOS RELEVANTES</w:t>
+        <w:t>SHOWCASE OPEN-SOURCE</w:t>
       </w:r>
     </w:p>
     <w:p>
       <w:pPr>
-        <w:pStyle w:val="ListBullet"/>
-        <w:spacing w:after="20" w:before="0"/>
+        <w:spacing w:after="80"/>
       </w:pPr>
       <w:r>
         <w:rPr>
@@ -801,135 +728,7 @@
           <w:b w:val="0"/>
           <w:sz w:val="20"/>
         </w:rPr>
-        <w:t>IA for Devs Full Cycle – Tech Week – Full Cycle (12/2025)</w:t>
-      </w:r>
-    </w:p>
-    <w:p>
-      <w:pPr>
-        <w:pStyle w:val="ListBullet"/>
-        <w:spacing w:after="20" w:before="0"/>
-      </w:pPr>
-      <w:r>
-        <w:rPr>
-          <w:rFonts w:ascii="Calibri" w:hAnsi="Calibri" w:eastAsia="Calibri"/>
-          <w:b w:val="0"/>
-          <w:sz w:val="20"/>
-        </w:rPr>
-        <w:t>Vue.js 3 Completo com Composition API, Vuex &amp; Vue Router – Udemy (12/2025)</w:t>
-      </w:r>
-    </w:p>
-    <w:p>
-      <w:pPr>
-        <w:pStyle w:val="ListBullet"/>
-        <w:spacing w:after="20" w:before="0"/>
-      </w:pPr>
-      <w:r>
-        <w:rPr>
-          <w:rFonts w:ascii="Calibri" w:hAnsi="Calibri" w:eastAsia="Calibri"/>
-          <w:b w:val="0"/>
-          <w:sz w:val="20"/>
-        </w:rPr>
-        <w:t>Aprenda TypeScript em 7 dias + Projetos Reais – Udemy (03/2025)</w:t>
-      </w:r>
-    </w:p>
-    <w:p>
-      <w:pPr>
-        <w:pStyle w:val="ListBullet"/>
-        <w:spacing w:after="20" w:before="0"/>
-      </w:pPr>
-      <w:r>
-        <w:rPr>
-          <w:rFonts w:ascii="Calibri" w:hAnsi="Calibri" w:eastAsia="Calibri"/>
-          <w:b w:val="0"/>
-          <w:sz w:val="20"/>
-        </w:rPr>
-        <w:t>Fundamentos do React Native – Rocketseat (02/2025)</w:t>
-      </w:r>
-    </w:p>
-    <w:p>
-      <w:pPr>
-        <w:pStyle w:val="ListBullet"/>
-        <w:spacing w:after="20" w:before="0"/>
-      </w:pPr>
-      <w:r>
-        <w:rPr>
-          <w:rFonts w:ascii="Calibri" w:hAnsi="Calibri" w:eastAsia="Calibri"/>
-          <w:b w:val="0"/>
-          <w:sz w:val="20"/>
-        </w:rPr>
-        <w:t>PHP e Clean Architecture / PHP e Domain Driven Design – Alura (09/2021)</w:t>
-      </w:r>
-    </w:p>
-    <w:p>
-      <w:pPr>
-        <w:pStyle w:val="ListBullet"/>
-        <w:spacing w:after="20" w:before="0"/>
-      </w:pPr>
-      <w:r>
-        <w:rPr>
-          <w:rFonts w:ascii="Calibri" w:hAnsi="Calibri" w:eastAsia="Calibri"/>
-          <w:b w:val="0"/>
-          <w:sz w:val="20"/>
-        </w:rPr>
-        <w:t>Testes Unitários e TDD com PHP e PHPUnit – Udemy (06/2021)</w:t>
-      </w:r>
-    </w:p>
-    <w:p>
-      <w:pPr>
-        <w:pStyle w:val="ListBullet"/>
-        <w:spacing w:after="20" w:before="0"/>
-      </w:pPr>
-      <w:r>
-        <w:rPr>
-          <w:rFonts w:ascii="Calibri" w:hAnsi="Calibri" w:eastAsia="Calibri"/>
-          <w:b w:val="0"/>
-          <w:sz w:val="20"/>
-        </w:rPr>
-        <w:t>Introdução à Arquitetura Hexagonal – Udemy (06/2021)</w:t>
-      </w:r>
-    </w:p>
-    <w:p>
-      <w:pPr>
-        <w:pStyle w:val="ListBullet"/>
-        <w:spacing w:after="20" w:before="0"/>
-      </w:pPr>
-      <w:r>
-        <w:rPr>
-          <w:rFonts w:ascii="Calibri" w:hAnsi="Calibri" w:eastAsia="Calibri"/>
-          <w:b w:val="0"/>
-          <w:sz w:val="20"/>
-        </w:rPr>
-        <w:t>SOLID com PHP / Design Patterns em PHP – Alura (01–04/2021)</w:t>
-      </w:r>
-    </w:p>
-    <w:p>
-      <w:pPr>
-        <w:spacing w:before="200" w:after="80"/>
-        <w:pBdr>
-          <w:bottom w:val="single" w:sz="12" w:space="4" w:color="1A365D"/>
-        </w:pBdr>
-      </w:pPr>
-      <w:r>
-        <w:rPr>
-          <w:rFonts w:ascii="Calibri" w:hAnsi="Calibri" w:eastAsia="Calibri"/>
-          <w:b/>
-          <w:color w:val="1A365D"/>
-          <w:sz w:val="28"/>
-        </w:rPr>
-        <w:t>PROJETOS (GITHUB)</w:t>
-      </w:r>
-    </w:p>
-    <w:p>
-      <w:pPr>
-        <w:spacing w:after="80" w:before="0"/>
-      </w:pPr>
-      <w:r>
-        <w:rPr>
-          <w:rFonts w:ascii="Calibri" w:hAnsi="Calibri" w:eastAsia="Calibri"/>
-          <w:b w:val="0"/>
-          <w:sz w:val="20"/>
-        </w:rPr>
-        <w:t>github.com/wagnerchimenez — destaques: sistema-gestao-pedidos (NestJS + React, DDD, CI/CD, AWS), chat-nestjs, livros (PHP), react-hooks (demo).</w:t>
+        <w:t>gestao-pedidos-laravel — Laravel + Inertia/Vue 3, filas Redis, Pest, Docker e CI (pasta no GitHub profile).</w:t>
       </w:r>
     </w:p>
     <w:sectPr>

</xml_diff>

<commit_message>
Migra showcase para React e alinha textos do perfil
Substitui Vue por React/Inertia no gestao-pedidos-laravel e atualiza
README do GitHub, LinkedIn e currículo para o posicionamento Laravel + React.
</commit_message>
<xml_diff>
--- a/perfil/Curriculo_Wagner_Lima_Chimenez.docx
+++ b/perfil/Curriculo_Wagner_Lima_Chimenez.docx
@@ -26,7 +26,7 @@
           <w:b/>
           <w:sz w:val="22"/>
         </w:rPr>
-        <w:t>Desenvolvedor Full Stack Sênior  ·  PHP · Laravel · Vue.js / Inertia</w:t>
+        <w:t>Desenvolvedor Full Stack Sênior  ·  PHP · Laravel · React / Inertia</w:t>
       </w:r>
     </w:p>
     <w:p>
@@ -72,7 +72,7 @@
           <w:b w:val="0"/>
           <w:sz w:val="20"/>
         </w:rPr>
-        <w:t>Desenvolvedor Full Stack Sênior com foco em PHP, Laravel e Vue.js (Inertia). Experiência em e-commerce, SaaS em produção, APIs REST, filas, Docker e TDD. Busco oportunidades remotas em Full Stack / Backend PHP/Laravel + Vue/Inertia.</w:t>
+        <w:t>Desenvolvedor Full Stack Sênior com foco em PHP, Laravel e React (Inertia). Experiência em e-commerce, SaaS em produção, APIs REST, filas, Docker e TDD. Busco oportunidades remotas em Full Stack / Backend PHP/Laravel + React/Inertia.</w:t>
       </w:r>
     </w:p>
     <w:p>
@@ -102,7 +102,7 @@
           <w:b w:val="0"/>
           <w:sz w:val="20"/>
         </w:rPr>
-        <w:t>Officina Pro (SaaS próprio) — https://officinapro.com.br — gestão para oficinas · Laravel + Inertia/Vue</w:t>
+        <w:t>Officina Pro (SaaS próprio) — https://officinapro.com.br — Laravel + Inertia</w:t>
       </w:r>
     </w:p>
     <w:p>
@@ -115,7 +115,7 @@
           <w:b w:val="0"/>
           <w:sz w:val="20"/>
         </w:rPr>
-        <w:t>Salão Elite (SaaS próprio) — https://salaoelite.com.br — gestão para salões · Laravel + Inertia/Vue</w:t>
+        <w:t>Salão Elite (SaaS próprio) — https://salaoelite.com.br — Laravel + Inertia</w:t>
       </w:r>
     </w:p>
     <w:p>
@@ -128,7 +128,7 @@
           <w:b w:val="0"/>
           <w:sz w:val="20"/>
         </w:rPr>
-        <w:t>Iguatemi Notícias (cliente) — https://iguateminoticias.com.br — portal de notícias · Laravel</w:t>
+        <w:t>Iguatemi Notícias (cliente) — https://iguateminoticias.com.br — Laravel</w:t>
       </w:r>
     </w:p>
     <w:p>
@@ -171,7 +171,7 @@
           <w:b w:val="0"/>
           <w:sz w:val="20"/>
         </w:rPr>
-        <w:t>Frontend: Vue.js, JavaScript, TypeScript, React (quando necessário)</w:t>
+        <w:t>Frontend: React, JavaScript, TypeScript, Vue.js (quando necessário)</w:t>
       </w:r>
     </w:p>
     <w:p>
@@ -728,7 +728,7 @@
           <w:b w:val="0"/>
           <w:sz w:val="20"/>
         </w:rPr>
-        <w:t>gestao-pedidos-laravel — Laravel + Inertia/Vue 3, filas Redis, Pest, Docker e CI (pasta no GitHub profile).</w:t>
+        <w:t>gestao-pedidos-laravel — Laravel + Inertia/React, filas Redis, Pest, Docker e CI.</w:t>
       </w:r>
     </w:p>
     <w:sectPr>

</xml_diff>

<commit_message>
Remove o showcase gestao-pedidos-laravel do repositório de perfil
Apaga o app demo e limpa referências no README e nos materiais de perfil.

Co-authored-by: Wagner Lima Chimenez <wagnerchimenez@users.noreply.github.com>
</commit_message>
<xml_diff>
--- a/perfil/Curriculo_Wagner_Lima_Chimenez.docx
+++ b/perfil/Curriculo_Wagner_Lima_Chimenez.docx
@@ -701,36 +701,6 @@
         <w:t>Bacharelado em Ciência da Computação — UNIGRAN · 2005–2010</w:t>
       </w:r>
     </w:p>
-    <w:p>
-      <w:pPr>
-        <w:spacing w:before="200" w:after="80"/>
-        <w:pBdr>
-          <w:bottom w:val="single" w:sz="12" w:space="4" w:color="1A365D"/>
-        </w:pBdr>
-      </w:pPr>
-      <w:r>
-        <w:rPr>
-          <w:rFonts w:ascii="Calibri" w:hAnsi="Calibri" w:eastAsia="Calibri"/>
-          <w:b/>
-          <w:color w:val="1A365D"/>
-          <w:sz w:val="28"/>
-        </w:rPr>
-        <w:t>SHOWCASE OPEN-SOURCE</w:t>
-      </w:r>
-    </w:p>
-    <w:p>
-      <w:pPr>
-        <w:spacing w:after="80"/>
-      </w:pPr>
-      <w:r>
-        <w:rPr>
-          <w:rFonts w:ascii="Calibri" w:hAnsi="Calibri" w:eastAsia="Calibri"/>
-          <w:b w:val="0"/>
-          <w:sz w:val="20"/>
-        </w:rPr>
-        <w:t>gestao-pedidos-laravel — Laravel + Inertia/React, filas Redis, Pest, Docker e CI.</w:t>
-      </w:r>
-    </w:p>
     <w:sectPr>
       <w:pgSz w:w="12240" w:h="15840"/>
       <w:pgMar w:top="850" w:right="1020" w:bottom="850" w:left="1020" w:header="720" w:footer="720" w:gutter="0"/>

</xml_diff>

<commit_message>
Atualiza currículo Word focado em vagas PHP/Laravel
Reescreve o conteúdo com resumo orientado a PHP 8, produtos SaaS
em produção, bullets de impacto e certificações enxutas; regenera
o .docx e alinha posicionamento/plano à pesquisa de mercado 2026.

Co-authored-by: Wagner Lima Chimenez <wagnerchimenez@users.noreply.github.com>
</commit_message>
<xml_diff>
--- a/perfil/Curriculo_Wagner_Lima_Chimenez.docx
+++ b/perfil/Curriculo_Wagner_Lima_Chimenez.docx
@@ -4,20 +4,22 @@
   <w:body>
     <w:p>
       <w:pPr>
+        <w:spacing w:before="0" w:after="40" w:line="240" w:lineRule="auto"/>
         <w:jc w:val="center"/>
       </w:pPr>
       <w:r>
         <w:rPr>
           <w:rFonts w:ascii="Calibri" w:hAnsi="Calibri" w:eastAsia="Calibri"/>
           <w:b/>
-          <w:color w:val="1A365D"/>
+          <w:color w:val="1A3A5C"/>
           <w:sz w:val="36"/>
         </w:rPr>
-        <w:t>WAGNER LIMA CHIMENEZ</w:t>
+        <w:t>Wagner Lima Chimenez</w:t>
       </w:r>
     </w:p>
     <w:p>
       <w:pPr>
+        <w:spacing w:before="0" w:after="40" w:line="240" w:lineRule="auto"/>
         <w:jc w:val="center"/>
       </w:pPr>
       <w:r>
@@ -26,326 +28,547 @@
           <w:b/>
           <w:sz w:val="22"/>
         </w:rPr>
-        <w:t>Desenvolvedor Full Stack Sênior  ·  PHP · Laravel · React / Inertia</w:t>
+        <w:t>Desenvolvedor Full Stack Sênior · PHP · Laravel · React</w:t>
       </w:r>
     </w:p>
     <w:p>
       <w:pPr>
+        <w:spacing w:before="0" w:after="20" w:line="240" w:lineRule="auto"/>
         <w:jc w:val="center"/>
       </w:pPr>
       <w:r>
         <w:rPr>
           <w:rFonts w:ascii="Calibri" w:hAnsi="Calibri" w:eastAsia="Calibri"/>
           <w:b w:val="0"/>
-          <w:color w:val="4A5568"/>
+          <w:color w:val="333333"/>
           <w:sz w:val="18"/>
         </w:rPr>
-        <w:t>Dourados, MS – Brasil  |  Remoto  |  (67) 99926-2419</w:t>
-        <w:br/>
-        <w:t>wagnerllchimenez.comp@gmail.com  |  linkedin.com/in/wagner-lima-chimenez-2b0386153  |  github.com/wagnerchimenez</w:t>
+        <w:t>Dourados, MS – Brasil | Remoto | (67) 99926-2419 | wagnerllchimenez.comp@gmail.com</w:t>
       </w:r>
     </w:p>
     <w:p>
       <w:pPr>
-        <w:spacing w:before="200" w:after="80"/>
+        <w:spacing w:before="0" w:after="120" w:line="240" w:lineRule="auto"/>
+        <w:jc w:val="center"/>
+      </w:pPr>
+      <w:r>
+        <w:rPr>
+          <w:rFonts w:ascii="Calibri" w:hAnsi="Calibri" w:eastAsia="Calibri"/>
+          <w:b w:val="0"/>
+          <w:color w:val="333333"/>
+          <w:sz w:val="18"/>
+        </w:rPr>
+        <w:t>LinkedIn: linkedin.com/in/wagner-lima-chimenez-2b0386153  ·  GitHub: github.com/wagnerchimenez</w:t>
+      </w:r>
+    </w:p>
+    <w:p>
+      <w:pPr>
+        <w:spacing w:before="200" w:after="40" w:line="240" w:lineRule="auto"/>
         <w:pBdr>
-          <w:bottom w:val="single" w:sz="12" w:space="4" w:color="1A365D"/>
+          <w:bottom w:val="single" w:sz="12" w:space="4" w:color="1A3A5C"/>
         </w:pBdr>
       </w:pPr>
       <w:r>
         <w:rPr>
           <w:rFonts w:ascii="Calibri" w:hAnsi="Calibri" w:eastAsia="Calibri"/>
           <w:b/>
-          <w:color w:val="1A365D"/>
-          <w:sz w:val="28"/>
+          <w:color w:val="1A3A5C"/>
+          <w:sz w:val="22"/>
         </w:rPr>
-        <w:t>OBJETIVO</w:t>
+        <w:t>RESUMO</w:t>
       </w:r>
     </w:p>
     <w:p>
       <w:pPr>
-        <w:spacing w:after="80"/>
+        <w:spacing w:before="0" w:after="80" w:line="240" w:lineRule="auto"/>
       </w:pPr>
       <w:r>
         <w:rPr>
           <w:rFonts w:ascii="Calibri" w:hAnsi="Calibri" w:eastAsia="Calibri"/>
           <w:b w:val="0"/>
-          <w:sz w:val="20"/>
+          <w:sz w:val="19"/>
         </w:rPr>
-        <w:t>Desenvolvedor Full Stack Sênior com foco em PHP, Laravel e React (Inertia). Experiência em e-commerce, SaaS em produção, APIs REST, filas, Docker e TDD. Busco oportunidades remotas em Full Stack / Backend PHP/Laravel + React/Inertia.</w:t>
+        <w:t>Desenvolvedor Full Stack Sênior com ~15 anos em aplicações web, foco em PHP 8, Laravel e React (Inertia). Experiência em e-commerce de médio/grande porte (Tray), SaaS próprios em produção, APIs REST, filas (RabbitMQ), Redis, Docker, TDD e monitoramento (New Relic/Graylog). Também atuei com Symfony em sistemas corporativos. Busco oportunidades remotas como Full Stack ou Backend PHP/Laravel.</w:t>
       </w:r>
     </w:p>
     <w:p>
       <w:pPr>
-        <w:spacing w:before="200" w:after="80"/>
+        <w:spacing w:before="200" w:after="40" w:line="240" w:lineRule="auto"/>
         <w:pBdr>
-          <w:bottom w:val="single" w:sz="12" w:space="4" w:color="1A365D"/>
+          <w:bottom w:val="single" w:sz="12" w:space="4" w:color="1A3A5C"/>
         </w:pBdr>
       </w:pPr>
       <w:r>
         <w:rPr>
           <w:rFonts w:ascii="Calibri" w:hAnsi="Calibri" w:eastAsia="Calibri"/>
           <w:b/>
-          <w:color w:val="1A365D"/>
-          <w:sz w:val="28"/>
+          <w:color w:val="1A3A5C"/>
+          <w:sz w:val="22"/>
         </w:rPr>
         <w:t>PRODUTOS E PROJETOS EM PRODUÇÃO</w:t>
       </w:r>
     </w:p>
     <w:p>
       <w:pPr>
-        <w:spacing w:after="80"/>
+        <w:spacing w:before="80" w:after="0" w:line="240" w:lineRule="auto"/>
+      </w:pPr>
+      <w:r>
+        <w:rPr>
+          <w:rFonts w:ascii="Calibri" w:hAnsi="Calibri" w:eastAsia="Calibri"/>
+          <w:b/>
+          <w:sz w:val="20"/>
+        </w:rPr>
+        <w:t>Officina Pro — SaaS próprio</w:t>
+      </w:r>
+      <w:r>
+        <w:rPr>
+          <w:rFonts w:ascii="Calibri" w:hAnsi="Calibri" w:eastAsia="Calibri"/>
+          <w:b w:val="0"/>
+          <w:color w:val="666666"/>
+          <w:sz w:val="20"/>
+        </w:rPr>
+        <w:t xml:space="preserve">  —  </w:t>
+      </w:r>
+      <w:r>
+        <w:rPr>
+          <w:rFonts w:ascii="Calibri" w:hAnsi="Calibri" w:eastAsia="Calibri"/>
+          <w:b w:val="0"/>
+          <w:color w:val="1A5C96"/>
+          <w:sz w:val="18"/>
+        </w:rPr>
+        <w:t>https://officinapro.com.br</w:t>
+      </w:r>
+    </w:p>
+    <w:p>
+      <w:pPr>
+        <w:pStyle w:val="ListBullet"/>
+        <w:spacing w:before="0" w:after="20"/>
       </w:pPr>
       <w:r>
         <w:rPr>
           <w:rFonts w:ascii="Calibri" w:hAnsi="Calibri" w:eastAsia="Calibri"/>
           <w:b w:val="0"/>
-          <w:sz w:val="20"/>
+          <w:sz w:val="19"/>
         </w:rPr>
-        <w:t>Officina Pro (SaaS próprio) — https://officinapro.com.br — Laravel + Inertia</w:t>
+        <w:t>SaaS de gestão para oficinas mecânicas em produção</w:t>
       </w:r>
     </w:p>
     <w:p>
       <w:pPr>
-        <w:spacing w:after="80"/>
+        <w:pStyle w:val="ListBullet"/>
+        <w:spacing w:before="0" w:after="20"/>
       </w:pPr>
       <w:r>
         <w:rPr>
           <w:rFonts w:ascii="Calibri" w:hAnsi="Calibri" w:eastAsia="Calibri"/>
           <w:b w:val="0"/>
-          <w:sz w:val="20"/>
+          <w:sz w:val="19"/>
         </w:rPr>
-        <w:t>Salão Elite (SaaS próprio) — https://salaoelite.com.br — Laravel + Inertia</w:t>
+        <w:t>Stack: PHP, Laravel, Inertia.js — desenvolvimento, manutenção e evolução do produto</w:t>
       </w:r>
     </w:p>
     <w:p>
       <w:pPr>
-        <w:spacing w:after="80"/>
+        <w:spacing w:before="80" w:after="0" w:line="240" w:lineRule="auto"/>
+      </w:pPr>
+      <w:r>
+        <w:rPr>
+          <w:rFonts w:ascii="Calibri" w:hAnsi="Calibri" w:eastAsia="Calibri"/>
+          <w:b/>
+          <w:sz w:val="20"/>
+        </w:rPr>
+        <w:t>Salão Elite — SaaS próprio</w:t>
+      </w:r>
+      <w:r>
+        <w:rPr>
+          <w:rFonts w:ascii="Calibri" w:hAnsi="Calibri" w:eastAsia="Calibri"/>
+          <w:b w:val="0"/>
+          <w:color w:val="666666"/>
+          <w:sz w:val="20"/>
+        </w:rPr>
+        <w:t xml:space="preserve">  —  </w:t>
+      </w:r>
+      <w:r>
+        <w:rPr>
+          <w:rFonts w:ascii="Calibri" w:hAnsi="Calibri" w:eastAsia="Calibri"/>
+          <w:b w:val="0"/>
+          <w:color w:val="1A5C96"/>
+          <w:sz w:val="18"/>
+        </w:rPr>
+        <w:t>https://salaoelite.com.br</w:t>
+      </w:r>
+    </w:p>
+    <w:p>
+      <w:pPr>
+        <w:pStyle w:val="ListBullet"/>
+        <w:spacing w:before="0" w:after="20"/>
       </w:pPr>
       <w:r>
         <w:rPr>
           <w:rFonts w:ascii="Calibri" w:hAnsi="Calibri" w:eastAsia="Calibri"/>
           <w:b w:val="0"/>
-          <w:sz w:val="20"/>
+          <w:sz w:val="19"/>
         </w:rPr>
-        <w:t>Iguatemi Notícias (cliente) — https://iguateminoticias.com.br — Laravel</w:t>
+        <w:t>SaaS de gestão para salões de beleza em produção</w:t>
       </w:r>
     </w:p>
     <w:p>
       <w:pPr>
-        <w:spacing w:before="200" w:after="80"/>
+        <w:pStyle w:val="ListBullet"/>
+        <w:spacing w:before="0" w:after="20"/>
+      </w:pPr>
+      <w:r>
+        <w:rPr>
+          <w:rFonts w:ascii="Calibri" w:hAnsi="Calibri" w:eastAsia="Calibri"/>
+          <w:b w:val="0"/>
+          <w:sz w:val="19"/>
+        </w:rPr>
+        <w:t>Stack: PHP, Laravel, Inertia.js — segundo produto SaaS (entrega ponta a ponta)</w:t>
+      </w:r>
+    </w:p>
+    <w:p>
+      <w:pPr>
+        <w:spacing w:before="80" w:after="0" w:line="240" w:lineRule="auto"/>
+      </w:pPr>
+      <w:r>
+        <w:rPr>
+          <w:rFonts w:ascii="Calibri" w:hAnsi="Calibri" w:eastAsia="Calibri"/>
+          <w:b/>
+          <w:sz w:val="20"/>
+        </w:rPr>
+        <w:t>Iguatemi Notícias — cliente</w:t>
+      </w:r>
+      <w:r>
+        <w:rPr>
+          <w:rFonts w:ascii="Calibri" w:hAnsi="Calibri" w:eastAsia="Calibri"/>
+          <w:b w:val="0"/>
+          <w:color w:val="666666"/>
+          <w:sz w:val="20"/>
+        </w:rPr>
+        <w:t xml:space="preserve">  —  </w:t>
+      </w:r>
+      <w:r>
+        <w:rPr>
+          <w:rFonts w:ascii="Calibri" w:hAnsi="Calibri" w:eastAsia="Calibri"/>
+          <w:b w:val="0"/>
+          <w:color w:val="1A5C96"/>
+          <w:sz w:val="18"/>
+        </w:rPr>
+        <w:t>https://iguateminoticias.com.br</w:t>
+      </w:r>
+    </w:p>
+    <w:p>
+      <w:pPr>
+        <w:pStyle w:val="ListBullet"/>
+        <w:spacing w:before="0" w:after="20"/>
+      </w:pPr>
+      <w:r>
+        <w:rPr>
+          <w:rFonts w:ascii="Calibri" w:hAnsi="Calibri" w:eastAsia="Calibri"/>
+          <w:b w:val="0"/>
+          <w:sz w:val="19"/>
+        </w:rPr>
+        <w:t>Portal de notícias regionais em produção (PHP/Laravel) — desenvolvimento e manutenção</w:t>
+      </w:r>
+    </w:p>
+    <w:p>
+      <w:pPr>
+        <w:spacing w:before="200" w:after="40" w:line="240" w:lineRule="auto"/>
         <w:pBdr>
-          <w:bottom w:val="single" w:sz="12" w:space="4" w:color="1A365D"/>
+          <w:bottom w:val="single" w:sz="12" w:space="4" w:color="1A3A5C"/>
         </w:pBdr>
       </w:pPr>
       <w:r>
         <w:rPr>
           <w:rFonts w:ascii="Calibri" w:hAnsi="Calibri" w:eastAsia="Calibri"/>
           <w:b/>
-          <w:color w:val="1A365D"/>
-          <w:sz w:val="28"/>
+          <w:color w:val="1A3A5C"/>
+          <w:sz w:val="22"/>
         </w:rPr>
         <w:t>COMPETÊNCIAS TÉCNICAS</w:t>
       </w:r>
     </w:p>
     <w:p>
       <w:pPr>
-        <w:spacing w:after="80"/>
+        <w:spacing w:before="20" w:after="20" w:line="240" w:lineRule="auto"/>
       </w:pPr>
       <w:r>
         <w:rPr>
           <w:rFonts w:ascii="Calibri" w:hAnsi="Calibri" w:eastAsia="Calibri"/>
+          <w:b/>
+          <w:sz w:val="19"/>
+        </w:rPr>
+        <w:t xml:space="preserve">Backend: </w:t>
+      </w:r>
+      <w:r>
+        <w:rPr>
+          <w:rFonts w:ascii="Calibri" w:hAnsi="Calibri" w:eastAsia="Calibri"/>
           <w:b w:val="0"/>
-          <w:sz w:val="20"/>
+          <w:sz w:val="19"/>
         </w:rPr>
-        <w:t>Backend: PHP 8, Laravel, Symfony, Inertia.js, APIs REST</w:t>
+        <w:t>PHP 8, Laravel, Symfony, Inertia.js, APIs REST, Composer</w:t>
       </w:r>
     </w:p>
     <w:p>
       <w:pPr>
-        <w:spacing w:after="80"/>
+        <w:spacing w:before="20" w:after="20" w:line="240" w:lineRule="auto"/>
       </w:pPr>
       <w:r>
         <w:rPr>
           <w:rFonts w:ascii="Calibri" w:hAnsi="Calibri" w:eastAsia="Calibri"/>
+          <w:b/>
+          <w:sz w:val="19"/>
+        </w:rPr>
+        <w:t xml:space="preserve">Frontend: </w:t>
+      </w:r>
+      <w:r>
+        <w:rPr>
+          <w:rFonts w:ascii="Calibri" w:hAnsi="Calibri" w:eastAsia="Calibri"/>
           <w:b w:val="0"/>
-          <w:sz w:val="20"/>
+          <w:sz w:val="19"/>
         </w:rPr>
-        <w:t>Frontend: React, JavaScript, TypeScript, Vue.js (quando necessário)</w:t>
+        <w:t>React, JavaScript, TypeScript, Vue.js</w:t>
       </w:r>
     </w:p>
     <w:p>
       <w:pPr>
-        <w:spacing w:after="80"/>
+        <w:spacing w:before="20" w:after="20" w:line="240" w:lineRule="auto"/>
       </w:pPr>
       <w:r>
         <w:rPr>
           <w:rFonts w:ascii="Calibri" w:hAnsi="Calibri" w:eastAsia="Calibri"/>
+          <w:b/>
+          <w:sz w:val="19"/>
+        </w:rPr>
+        <w:t xml:space="preserve">Dados / async: </w:t>
+      </w:r>
+      <w:r>
+        <w:rPr>
+          <w:rFonts w:ascii="Calibri" w:hAnsi="Calibri" w:eastAsia="Calibri"/>
           <w:b w:val="0"/>
-          <w:sz w:val="20"/>
+          <w:sz w:val="19"/>
         </w:rPr>
-        <w:t>Dados/async: MySQL, PostgreSQL, Redis, RabbitMQ</w:t>
+        <w:t>MySQL, PostgreSQL, Redis, RabbitMQ</w:t>
       </w:r>
     </w:p>
     <w:p>
       <w:pPr>
-        <w:spacing w:after="80"/>
+        <w:spacing w:before="20" w:after="20" w:line="240" w:lineRule="auto"/>
       </w:pPr>
       <w:r>
         <w:rPr>
           <w:rFonts w:ascii="Calibri" w:hAnsi="Calibri" w:eastAsia="Calibri"/>
+          <w:b/>
+          <w:sz w:val="19"/>
+        </w:rPr>
+        <w:t xml:space="preserve">Qualidade / ops: </w:t>
+      </w:r>
+      <w:r>
+        <w:rPr>
+          <w:rFonts w:ascii="Calibri" w:hAnsi="Calibri" w:eastAsia="Calibri"/>
           <w:b w:val="0"/>
-          <w:sz w:val="20"/>
+          <w:sz w:val="19"/>
         </w:rPr>
-        <w:t>Qualidade/ops: PHPUnit, Pest, TDD, Docker, New Relic, Graylog, Git, Scrum/Kanban</w:t>
+        <w:t>PHPUnit, Pest, TDD, Docker, New Relic, Graylog, Git, Scrum, Kanban</w:t>
       </w:r>
     </w:p>
     <w:p>
       <w:pPr>
-        <w:spacing w:before="200" w:after="80"/>
+        <w:spacing w:before="20" w:after="20" w:line="240" w:lineRule="auto"/>
+      </w:pPr>
+      <w:r>
+        <w:rPr>
+          <w:rFonts w:ascii="Calibri" w:hAnsi="Calibri" w:eastAsia="Calibri"/>
+          <w:b/>
+          <w:sz w:val="19"/>
+        </w:rPr>
+        <w:t xml:space="preserve">Complementar: </w:t>
+      </w:r>
+      <w:r>
+        <w:rPr>
+          <w:rFonts w:ascii="Calibri" w:hAnsi="Calibri" w:eastAsia="Calibri"/>
+          <w:b w:val="0"/>
+          <w:sz w:val="19"/>
+        </w:rPr>
+        <w:t>NestJS, Flutter, React Native</w:t>
+      </w:r>
+    </w:p>
+    <w:p>
+      <w:pPr>
+        <w:spacing w:before="200" w:after="40" w:line="240" w:lineRule="auto"/>
         <w:pBdr>
-          <w:bottom w:val="single" w:sz="12" w:space="4" w:color="1A365D"/>
+          <w:bottom w:val="single" w:sz="12" w:space="4" w:color="1A3A5C"/>
         </w:pBdr>
       </w:pPr>
       <w:r>
         <w:rPr>
           <w:rFonts w:ascii="Calibri" w:hAnsi="Calibri" w:eastAsia="Calibri"/>
           <w:b/>
-          <w:color w:val="1A365D"/>
-          <w:sz w:val="28"/>
+          <w:color w:val="1A3A5C"/>
+          <w:sz w:val="22"/>
         </w:rPr>
         <w:t>EXPERIÊNCIA PROFISSIONAL</w:t>
       </w:r>
     </w:p>
     <w:p>
       <w:pPr>
-        <w:spacing w:before="160" w:after="0"/>
+        <w:spacing w:before="120" w:after="0" w:line="240" w:lineRule="auto"/>
       </w:pPr>
       <w:r>
         <w:rPr>
           <w:rFonts w:ascii="Calibri" w:hAnsi="Calibri" w:eastAsia="Calibri"/>
           <w:b/>
-          <w:sz w:val="22"/>
+          <w:sz w:val="20"/>
         </w:rPr>
-        <w:t>Desenvolvedor Full Stack Sênior</w:t>
+        <w:t>Desenvolvedor Full Stack Sênior — Knet (temporário)</w:t>
       </w:r>
       <w:r>
         <w:rPr>
           <w:rFonts w:ascii="Calibri" w:hAnsi="Calibri" w:eastAsia="Calibri"/>
           <w:b w:val="0"/>
-          <w:sz w:val="22"/>
+          <w:color w:val="666666"/>
+          <w:sz w:val="20"/>
         </w:rPr>
-        <w:t xml:space="preserve">  |  Knet (temporário)</w:t>
+        <w:t xml:space="preserve">  |  </w:t>
+      </w:r>
+      <w:r>
+        <w:rPr>
+          <w:rFonts w:ascii="Calibri" w:hAnsi="Calibri" w:eastAsia="Calibri"/>
+          <w:b w:val="0"/>
+          <w:color w:val="444444"/>
+          <w:sz w:val="18"/>
+        </w:rPr>
+        <w:t>dez/2025 – atual · Remoto</w:t>
       </w:r>
     </w:p>
     <w:p>
       <w:pPr>
-        <w:spacing w:after="40"/>
+        <w:pStyle w:val="ListBullet"/>
+        <w:spacing w:before="0" w:after="20" w:line="240" w:lineRule="auto"/>
       </w:pPr>
       <w:r>
         <w:rPr>
           <w:rFonts w:ascii="Calibri" w:hAnsi="Calibri" w:eastAsia="Calibri"/>
           <w:b w:val="0"/>
-          <w:color w:val="4A5568"/>
-          <w:sz w:val="20"/>
+          <w:sz w:val="19"/>
         </w:rPr>
-        <w:t>dez/2025 – atual  ·  Remoto</w:t>
+        <w:t>Evoluí sistema web com Laravel no backend e Vue.js/PrimeVue no frontend; módulos em React com TypeScript</w:t>
       </w:r>
     </w:p>
     <w:p>
       <w:pPr>
         <w:pStyle w:val="ListBullet"/>
-        <w:spacing w:after="20"/>
+        <w:spacing w:before="0" w:after="20" w:line="240" w:lineRule="auto"/>
       </w:pPr>
       <w:r>
         <w:rPr>
           <w:rFonts w:ascii="Calibri" w:hAnsi="Calibri" w:eastAsia="Calibri"/>
           <w:b w:val="0"/>
-          <w:sz w:val="20"/>
+          <w:sz w:val="19"/>
         </w:rPr>
-        <w:t>Laravel + Vue/PrimeVue e React/TypeScript; APIs REST e meios de pagamento; MySQL.</w:t>
+        <w:t>Implementei e mantive APIs REST e integração com meios de pagamento; MySQL</w:t>
       </w:r>
     </w:p>
     <w:p>
       <w:pPr>
-        <w:spacing w:before="160" w:after="0"/>
+        <w:pStyle w:val="ListBullet"/>
+        <w:spacing w:before="0" w:after="20" w:line="240" w:lineRule="auto"/>
+      </w:pPr>
+      <w:r>
+        <w:rPr>
+          <w:rFonts w:ascii="Calibri" w:hAnsi="Calibri" w:eastAsia="Calibri"/>
+          <w:b w:val="0"/>
+          <w:sz w:val="19"/>
+        </w:rPr>
+        <w:t>Atuei remoto com entregas contínuas de funcionalidades e correções</w:t>
+      </w:r>
+    </w:p>
+    <w:p>
+      <w:pPr>
+        <w:spacing w:before="120" w:after="0" w:line="240" w:lineRule="auto"/>
       </w:pPr>
       <w:r>
         <w:rPr>
           <w:rFonts w:ascii="Calibri" w:hAnsi="Calibri" w:eastAsia="Calibri"/>
           <w:b/>
-          <w:sz w:val="22"/>
+          <w:sz w:val="20"/>
         </w:rPr>
-        <w:t>Desenvolvedor Full Stack Sênior</w:t>
+        <w:t>Desenvolvedor Full Stack Sênior — BDS Sistemas (temporário)</w:t>
       </w:r>
       <w:r>
         <w:rPr>
           <w:rFonts w:ascii="Calibri" w:hAnsi="Calibri" w:eastAsia="Calibri"/>
           <w:b w:val="0"/>
-          <w:sz w:val="22"/>
+          <w:color w:val="666666"/>
+          <w:sz w:val="20"/>
         </w:rPr>
-        <w:t xml:space="preserve">  |  BDS Sistemas (temporário)</w:t>
+        <w:t xml:space="preserve">  |  </w:t>
+      </w:r>
+      <w:r>
+        <w:rPr>
+          <w:rFonts w:ascii="Calibri" w:hAnsi="Calibri" w:eastAsia="Calibri"/>
+          <w:b w:val="0"/>
+          <w:color w:val="444444"/>
+          <w:sz w:val="18"/>
+        </w:rPr>
+        <w:t>ago/2025 – out/2025 · Remoto</w:t>
       </w:r>
     </w:p>
     <w:p>
       <w:pPr>
-        <w:spacing w:after="40"/>
+        <w:pStyle w:val="ListBullet"/>
+        <w:spacing w:before="0" w:after="20" w:line="240" w:lineRule="auto"/>
       </w:pPr>
       <w:r>
         <w:rPr>
           <w:rFonts w:ascii="Calibri" w:hAnsi="Calibri" w:eastAsia="Calibri"/>
           <w:b w:val="0"/>
-          <w:color w:val="4A5568"/>
-          <w:sz w:val="20"/>
+          <w:sz w:val="19"/>
         </w:rPr>
-        <w:t>ago/2025 – out/2025  ·  Remoto</w:t>
+        <w:t>Desenvolvi chat interno para suporte (NestJS + PostgreSQL); integração Flutter/React via REST e WebSocket</w:t>
       </w:r>
     </w:p>
     <w:p>
       <w:pPr>
         <w:pStyle w:val="ListBullet"/>
-        <w:spacing w:after="20"/>
+        <w:spacing w:before="0" w:after="20" w:line="240" w:lineRule="auto"/>
       </w:pPr>
       <w:r>
         <w:rPr>
           <w:rFonts w:ascii="Calibri" w:hAnsi="Calibri" w:eastAsia="Calibri"/>
           <w:b w:val="0"/>
-          <w:sz w:val="20"/>
+          <w:sz w:val="19"/>
         </w:rPr>
-        <w:t>Chat interno NestJS + PostgreSQL; Flutter/React; REST e WebSocket.</w:t>
+        <w:t>Organizei o ambiente de desenvolvimento com containerização</w:t>
       </w:r>
     </w:p>
     <w:p>
       <w:pPr>
-        <w:spacing w:before="160" w:after="0"/>
+        <w:spacing w:before="120" w:after="0" w:line="240" w:lineRule="auto"/>
       </w:pPr>
       <w:r>
         <w:rPr>
           <w:rFonts w:ascii="Calibri" w:hAnsi="Calibri" w:eastAsia="Calibri"/>
           <w:b/>
-          <w:sz w:val="22"/>
+          <w:sz w:val="20"/>
         </w:rPr>
-        <w:t>Desenvolvedor Full Stack Sênior</w:t>
+        <w:t>Desenvolvedor Full Stack Sênior — Tray</w:t>
       </w:r>
       <w:r>
         <w:rPr>
           <w:rFonts w:ascii="Calibri" w:hAnsi="Calibri" w:eastAsia="Calibri"/>
           <w:b w:val="0"/>
-          <w:sz w:val="22"/>
+          <w:color w:val="666666"/>
+          <w:sz w:val="20"/>
         </w:rPr>
-        <w:t xml:space="preserve">  |  Tray</w:t>
+        <w:t xml:space="preserve">  |  </w:t>
       </w:r>
-    </w:p>
-    <w:p>
-      <w:pPr>
-        <w:spacing w:after="40"/>
-      </w:pPr>
       <w:r>
         <w:rPr>
           <w:rFonts w:ascii="Calibri" w:hAnsi="Calibri" w:eastAsia="Calibri"/>
           <w:b w:val="0"/>
-          <w:color w:val="4A5568"/>
-          <w:sz w:val="20"/>
+          <w:color w:val="444444"/>
+          <w:sz w:val="18"/>
         </w:rPr>
         <w:t>mar/2022 – jan/2025</w:t>
       </w:r>
@@ -353,48 +576,72 @@
     <w:p>
       <w:pPr>
         <w:pStyle w:val="ListBullet"/>
-        <w:spacing w:after="20"/>
+        <w:spacing w:before="0" w:after="20" w:line="240" w:lineRule="auto"/>
       </w:pPr>
       <w:r>
         <w:rPr>
           <w:rFonts w:ascii="Calibri" w:hAnsi="Calibri" w:eastAsia="Calibri"/>
           <w:b w:val="0"/>
-          <w:sz w:val="20"/>
+          <w:sz w:val="19"/>
         </w:rPr>
-        <w:t>E-commerce PHP/Laravel/Vue; APIs REST; TDD; New Relic/Graylog; RabbitMQ; Docker.</w:t>
+        <w:t>Desenvolvi funcionalidades na plataforma de e-commerce com PHP, Laravel e Vue.js</w:t>
       </w:r>
     </w:p>
     <w:p>
       <w:pPr>
-        <w:spacing w:before="160" w:after="0"/>
+        <w:pStyle w:val="ListBullet"/>
+        <w:spacing w:before="0" w:after="20" w:line="240" w:lineRule="auto"/>
+      </w:pPr>
+      <w:r>
+        <w:rPr>
+          <w:rFonts w:ascii="Calibri" w:hAnsi="Calibri" w:eastAsia="Calibri"/>
+          <w:b w:val="0"/>
+          <w:sz w:val="19"/>
+        </w:rPr>
+        <w:t>Criei e integrei APIs REST para comunicação entre sistemas internos e parceiros</w:t>
+      </w:r>
+    </w:p>
+    <w:p>
+      <w:pPr>
+        <w:pStyle w:val="ListBullet"/>
+        <w:spacing w:before="0" w:after="20" w:line="240" w:lineRule="auto"/>
+      </w:pPr>
+      <w:r>
+        <w:rPr>
+          <w:rFonts w:ascii="Calibri" w:hAnsi="Calibri" w:eastAsia="Calibri"/>
+          <w:b w:val="0"/>
+          <w:sz w:val="19"/>
+        </w:rPr>
+        <w:t>Apliquei TDD com PHPUnit; monitei com New Relic e Graylog; filas RabbitMQ; Docker</w:t>
+      </w:r>
+    </w:p>
+    <w:p>
+      <w:pPr>
+        <w:spacing w:before="120" w:after="0" w:line="240" w:lineRule="auto"/>
       </w:pPr>
       <w:r>
         <w:rPr>
           <w:rFonts w:ascii="Calibri" w:hAnsi="Calibri" w:eastAsia="Calibri"/>
           <w:b/>
-          <w:sz w:val="22"/>
+          <w:sz w:val="20"/>
         </w:rPr>
-        <w:t>Desenvolvedor Web</w:t>
+        <w:t>Desenvolvedor Web — PJBank</w:t>
       </w:r>
       <w:r>
         <w:rPr>
           <w:rFonts w:ascii="Calibri" w:hAnsi="Calibri" w:eastAsia="Calibri"/>
           <w:b w:val="0"/>
-          <w:sz w:val="22"/>
+          <w:color w:val="666666"/>
+          <w:sz w:val="20"/>
         </w:rPr>
-        <w:t xml:space="preserve">  |  PJBank</w:t>
+        <w:t xml:space="preserve">  |  </w:t>
       </w:r>
-    </w:p>
-    <w:p>
-      <w:pPr>
-        <w:spacing w:after="40"/>
-      </w:pPr>
       <w:r>
         <w:rPr>
           <w:rFonts w:ascii="Calibri" w:hAnsi="Calibri" w:eastAsia="Calibri"/>
           <w:b w:val="0"/>
-          <w:color w:val="4A5568"/>
-          <w:sz w:val="20"/>
+          <w:color w:val="444444"/>
+          <w:sz w:val="18"/>
         </w:rPr>
         <w:t>mar/2021 – fev/2022</w:t>
       </w:r>
@@ -402,48 +649,58 @@
     <w:p>
       <w:pPr>
         <w:pStyle w:val="ListBullet"/>
-        <w:spacing w:after="20"/>
+        <w:spacing w:before="0" w:after="20" w:line="240" w:lineRule="auto"/>
       </w:pPr>
       <w:r>
         <w:rPr>
           <w:rFonts w:ascii="Calibri" w:hAnsi="Calibri" w:eastAsia="Calibri"/>
           <w:b w:val="0"/>
-          <w:sz w:val="20"/>
+          <w:sz w:val="19"/>
         </w:rPr>
-        <w:t>Gestão condominial Symfony/Zend; APIs; PHPUnit/Behat; New Relic; RabbitMQ; Docker.</w:t>
+        <w:t>Evoluí sistema de gestão condominial com PHP, Symfony e Zend Framework</w:t>
       </w:r>
     </w:p>
     <w:p>
       <w:pPr>
-        <w:spacing w:before="160" w:after="0"/>
+        <w:pStyle w:val="ListBullet"/>
+        <w:spacing w:before="0" w:after="20" w:line="240" w:lineRule="auto"/>
+      </w:pPr>
+      <w:r>
+        <w:rPr>
+          <w:rFonts w:ascii="Calibri" w:hAnsi="Calibri" w:eastAsia="Calibri"/>
+          <w:b w:val="0"/>
+          <w:sz w:val="19"/>
+        </w:rPr>
+        <w:t>Integrei APIs REST; testes com PHPUnit e Behat; New Relic; RabbitMQ; Docker</w:t>
+      </w:r>
+    </w:p>
+    <w:p>
+      <w:pPr>
+        <w:spacing w:before="120" w:after="0" w:line="240" w:lineRule="auto"/>
       </w:pPr>
       <w:r>
         <w:rPr>
           <w:rFonts w:ascii="Calibri" w:hAnsi="Calibri" w:eastAsia="Calibri"/>
           <w:b/>
-          <w:sz w:val="22"/>
+          <w:sz w:val="20"/>
         </w:rPr>
-        <w:t>Desenvolvedor Web</w:t>
+        <w:t>Desenvolvedor Web — Before</w:t>
       </w:r>
       <w:r>
         <w:rPr>
           <w:rFonts w:ascii="Calibri" w:hAnsi="Calibri" w:eastAsia="Calibri"/>
           <w:b w:val="0"/>
-          <w:sz w:val="22"/>
+          <w:color w:val="666666"/>
+          <w:sz w:val="20"/>
         </w:rPr>
-        <w:t xml:space="preserve">  |  Before</w:t>
+        <w:t xml:space="preserve">  |  </w:t>
       </w:r>
-    </w:p>
-    <w:p>
-      <w:pPr>
-        <w:spacing w:after="40"/>
-      </w:pPr>
       <w:r>
         <w:rPr>
           <w:rFonts w:ascii="Calibri" w:hAnsi="Calibri" w:eastAsia="Calibri"/>
           <w:b w:val="0"/>
-          <w:color w:val="4A5568"/>
-          <w:sz w:val="20"/>
+          <w:color w:val="444444"/>
+          <w:sz w:val="18"/>
         </w:rPr>
         <w:t>nov/2020 – abr/2021</w:t>
       </w:r>
@@ -451,97 +708,89 @@
     <w:p>
       <w:pPr>
         <w:pStyle w:val="ListBullet"/>
-        <w:spacing w:after="20"/>
+        <w:spacing w:before="0" w:after="20" w:line="240" w:lineRule="auto"/>
       </w:pPr>
       <w:r>
         <w:rPr>
           <w:rFonts w:ascii="Calibri" w:hAnsi="Calibri" w:eastAsia="Calibri"/>
           <w:b w:val="0"/>
-          <w:sz w:val="20"/>
+          <w:sz w:val="19"/>
         </w:rPr>
-        <w:t>Telefonia móvel: Laravel/Symfony, Vue, TypeScript, MySQL, filas e Docker.</w:t>
+        <w:t>Sistema de telefonia móvel e vendas: Laravel/Symfony, Vue.js, TypeScript, MySQL, APIs REST, PHPUnit, RabbitMQ e Docker</w:t>
       </w:r>
     </w:p>
     <w:p>
       <w:pPr>
-        <w:spacing w:before="160" w:after="0"/>
+        <w:spacing w:before="120" w:after="0" w:line="240" w:lineRule="auto"/>
       </w:pPr>
       <w:r>
         <w:rPr>
           <w:rFonts w:ascii="Calibri" w:hAnsi="Calibri" w:eastAsia="Calibri"/>
           <w:b/>
-          <w:sz w:val="22"/>
+          <w:sz w:val="20"/>
         </w:rPr>
-        <w:t>Desenvolvedor Web</w:t>
+        <w:t>Desenvolvedor Web — Missão Caiuá</w:t>
       </w:r>
       <w:r>
         <w:rPr>
           <w:rFonts w:ascii="Calibri" w:hAnsi="Calibri" w:eastAsia="Calibri"/>
           <w:b w:val="0"/>
-          <w:sz w:val="22"/>
+          <w:color w:val="666666"/>
+          <w:sz w:val="20"/>
         </w:rPr>
-        <w:t xml:space="preserve">  |  Missão Caiuá</w:t>
+        <w:t xml:space="preserve">  |  </w:t>
+      </w:r>
+      <w:r>
+        <w:rPr>
+          <w:rFonts w:ascii="Calibri" w:hAnsi="Calibri" w:eastAsia="Calibri"/>
+          <w:b w:val="0"/>
+          <w:color w:val="444444"/>
+          <w:sz w:val="18"/>
+        </w:rPr>
+        <w:t>mar/2018 – nov/2020 · Dourados, MS</w:t>
       </w:r>
     </w:p>
     <w:p>
       <w:pPr>
-        <w:spacing w:after="40"/>
+        <w:pStyle w:val="ListBullet"/>
+        <w:spacing w:before="0" w:after="20" w:line="240" w:lineRule="auto"/>
       </w:pPr>
       <w:r>
         <w:rPr>
           <w:rFonts w:ascii="Calibri" w:hAnsi="Calibri" w:eastAsia="Calibri"/>
           <w:b w:val="0"/>
-          <w:color w:val="4A5568"/>
-          <w:sz w:val="20"/>
+          <w:sz w:val="19"/>
         </w:rPr>
-        <w:t>mar/2018 – nov/2020  ·  Dourados, MS</w:t>
+        <w:t>Sistema de RH com PHP, Laravel/Symfony, Vue.js, MySQL e APIs REST; melhorias de usabilidade no frontend</w:t>
       </w:r>
     </w:p>
     <w:p>
       <w:pPr>
-        <w:pStyle w:val="ListBullet"/>
-        <w:spacing w:after="20"/>
-      </w:pPr>
-      <w:r>
-        <w:rPr>
-          <w:rFonts w:ascii="Calibri" w:hAnsi="Calibri" w:eastAsia="Calibri"/>
-          <w:b w:val="0"/>
-          <w:sz w:val="20"/>
-        </w:rPr>
-        <w:t>Sistema de RH: PHP, Laravel/Symfony, Vue.js, MySQL, APIs REST.</w:t>
-      </w:r>
-    </w:p>
-    <w:p>
-      <w:pPr>
-        <w:spacing w:before="160" w:after="0"/>
+        <w:spacing w:before="120" w:after="0" w:line="240" w:lineRule="auto"/>
       </w:pPr>
       <w:r>
         <w:rPr>
           <w:rFonts w:ascii="Calibri" w:hAnsi="Calibri" w:eastAsia="Calibri"/>
           <w:b/>
-          <w:sz w:val="22"/>
+          <w:sz w:val="20"/>
         </w:rPr>
-        <w:t>Desenvolvedor Web</w:t>
+        <w:t>Desenvolvedor Web — VEGA Tecnologia</w:t>
       </w:r>
       <w:r>
         <w:rPr>
           <w:rFonts w:ascii="Calibri" w:hAnsi="Calibri" w:eastAsia="Calibri"/>
           <w:b w:val="0"/>
-          <w:sz w:val="22"/>
+          <w:color w:val="666666"/>
+          <w:sz w:val="20"/>
         </w:rPr>
-        <w:t xml:space="preserve">  |  VEGA Tecnologia</w:t>
+        <w:t xml:space="preserve">  |  </w:t>
       </w:r>
-    </w:p>
-    <w:p>
-      <w:pPr>
-        <w:spacing w:after="40"/>
-      </w:pPr>
       <w:r>
         <w:rPr>
           <w:rFonts w:ascii="Calibri" w:hAnsi="Calibri" w:eastAsia="Calibri"/>
           <w:b w:val="0"/>
-          <w:color w:val="4A5568"/>
-          <w:sz w:val="20"/>
+          <w:color w:val="444444"/>
+          <w:sz w:val="18"/>
         </w:rPr>
         <w:t>jul/2016 – nov/2017</w:t>
       </w:r>
@@ -549,48 +798,44 @@
     <w:p>
       <w:pPr>
         <w:pStyle w:val="ListBullet"/>
-        <w:spacing w:after="20"/>
+        <w:spacing w:before="0" w:after="20" w:line="240" w:lineRule="auto"/>
       </w:pPr>
       <w:r>
         <w:rPr>
           <w:rFonts w:ascii="Calibri" w:hAnsi="Calibri" w:eastAsia="Calibri"/>
           <w:b w:val="0"/>
-          <w:sz w:val="20"/>
+          <w:sz w:val="19"/>
         </w:rPr>
-        <w:t>Plataforma EAD: PHP, Laravel, Vue.js, MySQL.</w:t>
+        <w:t>Plataforma EAD com PHP, Laravel, Vue.js, MySQL e APIs REST</w:t>
       </w:r>
     </w:p>
     <w:p>
       <w:pPr>
-        <w:spacing w:before="160" w:after="0"/>
+        <w:spacing w:before="120" w:after="0" w:line="240" w:lineRule="auto"/>
       </w:pPr>
       <w:r>
         <w:rPr>
           <w:rFonts w:ascii="Calibri" w:hAnsi="Calibri" w:eastAsia="Calibri"/>
           <w:b/>
-          <w:sz w:val="22"/>
+          <w:sz w:val="20"/>
         </w:rPr>
-        <w:t>Programador</w:t>
+        <w:t>Programador — Palancio Soluções</w:t>
       </w:r>
       <w:r>
         <w:rPr>
           <w:rFonts w:ascii="Calibri" w:hAnsi="Calibri" w:eastAsia="Calibri"/>
           <w:b w:val="0"/>
-          <w:sz w:val="22"/>
+          <w:color w:val="666666"/>
+          <w:sz w:val="20"/>
         </w:rPr>
-        <w:t xml:space="preserve">  |  Palancio</w:t>
+        <w:t xml:space="preserve">  |  </w:t>
       </w:r>
-    </w:p>
-    <w:p>
-      <w:pPr>
-        <w:spacing w:after="40"/>
-      </w:pPr>
       <w:r>
         <w:rPr>
           <w:rFonts w:ascii="Calibri" w:hAnsi="Calibri" w:eastAsia="Calibri"/>
           <w:b w:val="0"/>
-          <w:color w:val="4A5568"/>
-          <w:sz w:val="20"/>
+          <w:color w:val="444444"/>
+          <w:sz w:val="18"/>
         </w:rPr>
         <w:t>jan/2014 – dez/2014</w:t>
       </w:r>
@@ -598,48 +843,44 @@
     <w:p>
       <w:pPr>
         <w:pStyle w:val="ListBullet"/>
-        <w:spacing w:after="20"/>
+        <w:spacing w:before="0" w:after="20" w:line="240" w:lineRule="auto"/>
       </w:pPr>
       <w:r>
         <w:rPr>
           <w:rFonts w:ascii="Calibri" w:hAnsi="Calibri" w:eastAsia="Calibri"/>
           <w:b w:val="0"/>
-          <w:sz w:val="20"/>
+          <w:sz w:val="19"/>
         </w:rPr>
-        <w:t>PDV frente de caixa: PHP/Laravel, JavaScript, MySQL.</w:t>
+        <w:t>Sistema PDV (frente de caixa) com PHP/Laravel, JavaScript e MySQL</w:t>
       </w:r>
     </w:p>
     <w:p>
       <w:pPr>
-        <w:spacing w:before="160" w:after="0"/>
+        <w:spacing w:before="120" w:after="0" w:line="240" w:lineRule="auto"/>
       </w:pPr>
       <w:r>
         <w:rPr>
           <w:rFonts w:ascii="Calibri" w:hAnsi="Calibri" w:eastAsia="Calibri"/>
           <w:b/>
-          <w:sz w:val="22"/>
+          <w:sz w:val="20"/>
         </w:rPr>
-        <w:t>Desenvolvedor Web</w:t>
+        <w:t>Desenvolvedor Web — UNIGRAN</w:t>
       </w:r>
       <w:r>
         <w:rPr>
           <w:rFonts w:ascii="Calibri" w:hAnsi="Calibri" w:eastAsia="Calibri"/>
           <w:b w:val="0"/>
-          <w:sz w:val="22"/>
+          <w:color w:val="666666"/>
+          <w:sz w:val="20"/>
         </w:rPr>
-        <w:t xml:space="preserve">  |  UNIGRAN</w:t>
+        <w:t xml:space="preserve">  |  </w:t>
       </w:r>
-    </w:p>
-    <w:p>
-      <w:pPr>
-        <w:spacing w:after="40"/>
-      </w:pPr>
       <w:r>
         <w:rPr>
           <w:rFonts w:ascii="Calibri" w:hAnsi="Calibri" w:eastAsia="Calibri"/>
           <w:b w:val="0"/>
-          <w:color w:val="4A5568"/>
-          <w:sz w:val="20"/>
+          <w:color w:val="444444"/>
+          <w:sz w:val="18"/>
         </w:rPr>
         <w:t>jan/2011 – nov/2013</w:t>
       </w:r>
@@ -647,63 +888,164 @@
     <w:p>
       <w:pPr>
         <w:pStyle w:val="ListBullet"/>
-        <w:spacing w:after="20"/>
+        <w:spacing w:before="0" w:after="20" w:line="240" w:lineRule="auto"/>
       </w:pPr>
       <w:r>
         <w:rPr>
           <w:rFonts w:ascii="Calibri" w:hAnsi="Calibri" w:eastAsia="Calibri"/>
           <w:b w:val="0"/>
-          <w:sz w:val="20"/>
+          <w:sz w:val="19"/>
         </w:rPr>
-        <w:t>Sites e EAD: PHP, HTML, CSS, JavaScript, MySQL.</w:t>
+        <w:t>Sites e plataforma EAD: PHP, HTML, CSS, JavaScript e MySQL</w:t>
       </w:r>
     </w:p>
     <w:p>
       <w:pPr>
-        <w:spacing w:before="200" w:after="80"/>
+        <w:spacing w:before="200" w:after="40" w:line="240" w:lineRule="auto"/>
         <w:pBdr>
-          <w:bottom w:val="single" w:sz="12" w:space="4" w:color="1A365D"/>
+          <w:bottom w:val="single" w:sz="12" w:space="4" w:color="1A3A5C"/>
         </w:pBdr>
       </w:pPr>
       <w:r>
         <w:rPr>
           <w:rFonts w:ascii="Calibri" w:hAnsi="Calibri" w:eastAsia="Calibri"/>
           <w:b/>
-          <w:color w:val="1A365D"/>
-          <w:sz w:val="28"/>
+          <w:color w:val="1A3A5C"/>
+          <w:sz w:val="22"/>
         </w:rPr>
-        <w:t>FORMAÇÃO ACADÊMICA</w:t>
+        <w:t>FORMAÇÃO</w:t>
       </w:r>
     </w:p>
     <w:p>
       <w:pPr>
-        <w:spacing w:after="80"/>
+        <w:spacing w:before="40" w:after="20" w:line="240" w:lineRule="auto"/>
       </w:pPr>
       <w:r>
         <w:rPr>
           <w:rFonts w:ascii="Calibri" w:hAnsi="Calibri" w:eastAsia="Calibri"/>
           <w:b w:val="0"/>
-          <w:sz w:val="20"/>
+          <w:sz w:val="19"/>
         </w:rPr>
-        <w:t>Pós-graduação em Gestão de TI — Anhanguera · 2013–2014</w:t>
+        <w:t>Pós-graduação em Gestão de TI — Anhanguera Educacional · 2013–2014</w:t>
       </w:r>
     </w:p>
     <w:p>
       <w:pPr>
-        <w:spacing w:after="80"/>
+        <w:spacing w:before="0" w:after="40" w:line="240" w:lineRule="auto"/>
       </w:pPr>
       <w:r>
         <w:rPr>
           <w:rFonts w:ascii="Calibri" w:hAnsi="Calibri" w:eastAsia="Calibri"/>
           <w:b w:val="0"/>
-          <w:sz w:val="20"/>
+          <w:sz w:val="19"/>
         </w:rPr>
         <w:t>Bacharelado em Ciência da Computação — UNIGRAN · 2005–2010</w:t>
       </w:r>
     </w:p>
+    <w:p>
+      <w:pPr>
+        <w:spacing w:before="200" w:after="40" w:line="240" w:lineRule="auto"/>
+        <w:pBdr>
+          <w:bottom w:val="single" w:sz="12" w:space="4" w:color="1A3A5C"/>
+        </w:pBdr>
+      </w:pPr>
+      <w:r>
+        <w:rPr>
+          <w:rFonts w:ascii="Calibri" w:hAnsi="Calibri" w:eastAsia="Calibri"/>
+          <w:b/>
+          <w:color w:val="1A3A5C"/>
+          <w:sz w:val="22"/>
+        </w:rPr>
+        <w:t>CERTIFICAÇÕES RELEVANTES</w:t>
+      </w:r>
+    </w:p>
+    <w:p>
+      <w:pPr>
+        <w:pStyle w:val="ListBullet"/>
+        <w:spacing w:before="0" w:after="20"/>
+      </w:pPr>
+      <w:r>
+        <w:rPr>
+          <w:rFonts w:ascii="Calibri" w:hAnsi="Calibri" w:eastAsia="Calibri"/>
+          <w:b w:val="0"/>
+          <w:sz w:val="19"/>
+        </w:rPr>
+        <w:t>IA for Devs Full Cycle – Full Cycle (12/2025)</w:t>
+      </w:r>
+    </w:p>
+    <w:p>
+      <w:pPr>
+        <w:pStyle w:val="ListBullet"/>
+        <w:spacing w:before="0" w:after="20"/>
+      </w:pPr>
+      <w:r>
+        <w:rPr>
+          <w:rFonts w:ascii="Calibri" w:hAnsi="Calibri" w:eastAsia="Calibri"/>
+          <w:b w:val="0"/>
+          <w:sz w:val="19"/>
+        </w:rPr>
+        <w:t>Vue.js 3 Composition API – Udemy (12/2025)</w:t>
+      </w:r>
+    </w:p>
+    <w:p>
+      <w:pPr>
+        <w:pStyle w:val="ListBullet"/>
+        <w:spacing w:before="0" w:after="20"/>
+      </w:pPr>
+      <w:r>
+        <w:rPr>
+          <w:rFonts w:ascii="Calibri" w:hAnsi="Calibri" w:eastAsia="Calibri"/>
+          <w:b w:val="0"/>
+          <w:sz w:val="19"/>
+        </w:rPr>
+        <w:t>TypeScript – Udemy (03/2025)</w:t>
+      </w:r>
+    </w:p>
+    <w:p>
+      <w:pPr>
+        <w:pStyle w:val="ListBullet"/>
+        <w:spacing w:before="0" w:after="20"/>
+      </w:pPr>
+      <w:r>
+        <w:rPr>
+          <w:rFonts w:ascii="Calibri" w:hAnsi="Calibri" w:eastAsia="Calibri"/>
+          <w:b w:val="0"/>
+          <w:sz w:val="19"/>
+        </w:rPr>
+        <w:t>Clean Architecture / DDD com PHP – Alura (09/2021)</w:t>
+      </w:r>
+    </w:p>
+    <w:p>
+      <w:pPr>
+        <w:pStyle w:val="ListBullet"/>
+        <w:spacing w:before="0" w:after="20"/>
+      </w:pPr>
+      <w:r>
+        <w:rPr>
+          <w:rFonts w:ascii="Calibri" w:hAnsi="Calibri" w:eastAsia="Calibri"/>
+          <w:b w:val="0"/>
+          <w:sz w:val="19"/>
+        </w:rPr>
+        <w:t>TDD com PHPUnit / Arquitetura Hexagonal – Udemy (06/2021)</w:t>
+      </w:r>
+    </w:p>
+    <w:p>
+      <w:pPr>
+        <w:pStyle w:val="ListBullet"/>
+        <w:spacing w:before="0" w:after="20"/>
+      </w:pPr>
+      <w:r>
+        <w:rPr>
+          <w:rFonts w:ascii="Calibri" w:hAnsi="Calibri" w:eastAsia="Calibri"/>
+          <w:b w:val="0"/>
+          <w:sz w:val="19"/>
+        </w:rPr>
+        <w:t>SOLID e Design Patterns em PHP – Alura (2021)</w:t>
+      </w:r>
+    </w:p>
     <w:sectPr>
       <w:pgSz w:w="12240" w:h="15840"/>
-      <w:pgMar w:top="850" w:right="1020" w:bottom="850" w:left="1020" w:header="720" w:footer="720" w:gutter="0"/>
+      <w:pgMar w:top="794" w:right="907" w:bottom="794" w:left="907" w:header="720" w:footer="720" w:gutter="0"/>
       <w:cols w:space="720"/>
       <w:docGrid w:linePitch="360"/>
     </w:sectPr>
@@ -1074,6 +1416,10 @@
     <w:name w:val="Normal"/>
     <w:qFormat/>
     <w:rsid w:val="00FC693F"/>
+    <w:rPr>
+      <w:rFonts w:ascii="Calibri" w:hAnsi="Calibri" w:eastAsia="Calibri"/>
+      <w:sz w:val="20"/>
+    </w:rPr>
   </w:style>
   <w:style w:type="paragraph" w:styleId="Header">
     <w:name w:val="header"/>

</xml_diff>